<commit_message>
aplicação de api, e inicialização front
</commit_message>
<xml_diff>
--- a/emprezaLimpeza/Requisitos.docx
+++ b/emprezaLimpeza/Requisitos.docx
@@ -8,16 +8,16 @@
         <w:rPr>
           <w:b/>
           <w:bCs/>
-          <w:sz w:val="72"/>
-          <w:szCs w:val="72"/>
+          <w:sz w:val="56"/>
+          <w:szCs w:val="56"/>
         </w:rPr>
       </w:pPr>
       <w:r>
         <w:rPr>
           <w:b/>
           <w:bCs/>
-          <w:sz w:val="72"/>
-          <w:szCs w:val="72"/>
+          <w:sz w:val="56"/>
+          <w:szCs w:val="56"/>
         </w:rPr>
         <w:t>Requisitos funcionais</w:t>
       </w:r>
@@ -154,7 +154,14 @@
           <w:sz w:val="26"/>
           <w:szCs w:val="26"/>
         </w:rPr>
-        <w:t>Histórico de agendamentos</w:t>
+        <w:t>Mostra o h</w:t>
+      </w:r>
+      <w:r>
+        <w:rPr>
+          <w:sz w:val="26"/>
+          <w:szCs w:val="26"/>
+        </w:rPr>
+        <w:t>istórico de agendamentos</w:t>
       </w:r>
     </w:p>
     <w:p>
@@ -196,28 +203,72 @@
           <w:sz w:val="26"/>
           <w:szCs w:val="26"/>
         </w:rPr>
-        <w:t>Alerta caso conflito de horários</w:t>
+        <w:t>Função para determinar se o serviço foi concluído</w:t>
       </w:r>
     </w:p>
     <w:p>
       <w:pPr>
         <w:pStyle w:val="PargrafodaLista"/>
+        <w:spacing w:line="360" w:lineRule="auto"/>
+        <w:rPr>
+          <w:sz w:val="26"/>
+          <w:szCs w:val="26"/>
+        </w:rPr>
+      </w:pPr>
+    </w:p>
+    <w:p>
+      <w:pPr>
+        <w:pStyle w:val="PargrafodaLista"/>
+        <w:rPr>
+          <w:b/>
+          <w:bCs/>
+          <w:sz w:val="56"/>
+          <w:szCs w:val="56"/>
+        </w:rPr>
+      </w:pPr>
+      <w:r>
+        <w:rPr>
+          <w:b/>
+          <w:bCs/>
+          <w:sz w:val="56"/>
+          <w:szCs w:val="56"/>
+        </w:rPr>
+        <w:t>Requisitos</w:t>
+      </w:r>
+      <w:r>
+        <w:rPr>
+          <w:b/>
+          <w:bCs/>
+          <w:sz w:val="56"/>
+          <w:szCs w:val="56"/>
+        </w:rPr>
+        <w:t xml:space="preserve"> não</w:t>
+      </w:r>
+      <w:r>
+        <w:rPr>
+          <w:b/>
+          <w:bCs/>
+          <w:sz w:val="56"/>
+          <w:szCs w:val="56"/>
+        </w:rPr>
+        <w:t xml:space="preserve"> funcionais</w:t>
+      </w:r>
+    </w:p>
+    <w:p/>
+    <w:p>
+      <w:pPr>
+        <w:pStyle w:val="PargrafodaLista"/>
         <w:numPr>
           <w:ilvl w:val="0"/>
-          <w:numId w:val="2"/>
+          <w:numId w:val="5"/>
         </w:numPr>
-        <w:spacing w:line="360" w:lineRule="auto"/>
+      </w:pPr>
+      <w:r>
         <w:rPr>
           <w:sz w:val="26"/>
           <w:szCs w:val="26"/>
         </w:rPr>
-      </w:pPr>
-      <w:r>
-        <w:rPr>
-          <w:sz w:val="26"/>
-          <w:szCs w:val="26"/>
-        </w:rPr>
-        <w:t>Não permitir agendamento de faxina caso horário já estiver ocupado</w:t>
+        <w:t>Verifica envia alerta caso o horário do agendamento houver conflito de horários</w:t>
       </w:r>
     </w:p>
     <w:p>
@@ -225,23 +276,28 @@
         <w:pStyle w:val="PargrafodaLista"/>
         <w:numPr>
           <w:ilvl w:val="0"/>
-          <w:numId w:val="2"/>
+          <w:numId w:val="5"/>
         </w:numPr>
-        <w:spacing w:line="360" w:lineRule="auto"/>
-        <w:rPr>
-          <w:sz w:val="26"/>
-          <w:szCs w:val="26"/>
-        </w:rPr>
       </w:pPr>
       <w:r>
-        <w:rPr>
-          <w:sz w:val="26"/>
-          <w:szCs w:val="26"/>
-        </w:rPr>
-        <w:t>Função para determinar se o serviço foi concluído</w:t>
+        <w:t xml:space="preserve">Não pode </w:t>
+      </w:r>
+      <w:r>
+        <w:t>mostrar funcionários que estão inativos</w:t>
       </w:r>
     </w:p>
-    <w:p/>
+    <w:p>
+      <w:pPr>
+        <w:pStyle w:val="PargrafodaLista"/>
+        <w:numPr>
+          <w:ilvl w:val="0"/>
+          <w:numId w:val="5"/>
+        </w:numPr>
+      </w:pPr>
+      <w:r>
+        <w:t>Bloquear agendamentos caso horário já estiver preenchido</w:t>
+      </w:r>
+    </w:p>
     <w:sectPr>
       <w:pgSz w:w="12240" w:h="15840"/>
       <w:pgMar w:top="1417" w:right="1701" w:bottom="1417" w:left="1701" w:header="720" w:footer="720" w:gutter="0"/>
@@ -343,14 +399,14 @@
   <w:abstractNum w:abstractNumId="1" w15:restartNumberingAfterBreak="0">
     <w:nsid w:val="152E3C2A"/>
     <w:multiLevelType w:val="hybridMultilevel"/>
-    <w:tmpl w:val="88D60B34"/>
+    <w:tmpl w:val="B40CBAA6"/>
     <w:lvl w:ilvl="0" w:tplc="0416000F">
       <w:start w:val="1"/>
       <w:numFmt w:val="decimal"/>
       <w:lvlText w:val="%1."/>
       <w:lvlJc w:val="left"/>
       <w:pPr>
-        <w:ind w:left="720" w:hanging="360"/>
+        <w:ind w:left="927" w:hanging="360"/>
       </w:pPr>
     </w:lvl>
     <w:lvl w:ilvl="1" w:tplc="04160019" w:tentative="1">
@@ -417,6 +473,264 @@
       </w:pPr>
     </w:lvl>
     <w:lvl w:ilvl="8" w:tplc="0416001B" w:tentative="1">
+      <w:start w:val="1"/>
+      <w:numFmt w:val="lowerRoman"/>
+      <w:lvlText w:val="%9."/>
+      <w:lvlJc w:val="right"/>
+      <w:pPr>
+        <w:ind w:left="6480" w:hanging="180"/>
+      </w:pPr>
+    </w:lvl>
+  </w:abstractNum>
+  <w:abstractNum w:abstractNumId="2" w15:restartNumberingAfterBreak="0">
+    <w:nsid w:val="1FA06B65"/>
+    <w:multiLevelType w:val="hybridMultilevel"/>
+    <w:tmpl w:val="C20E3DB0"/>
+    <w:lvl w:ilvl="0" w:tplc="0416000F">
+      <w:start w:val="1"/>
+      <w:numFmt w:val="decimal"/>
+      <w:lvlText w:val="%1."/>
+      <w:lvlJc w:val="left"/>
+      <w:pPr>
+        <w:ind w:left="1068" w:hanging="360"/>
+      </w:pPr>
+    </w:lvl>
+    <w:lvl w:ilvl="1" w:tplc="04160019" w:tentative="1">
+      <w:start w:val="1"/>
+      <w:numFmt w:val="lowerLetter"/>
+      <w:lvlText w:val="%2."/>
+      <w:lvlJc w:val="left"/>
+      <w:pPr>
+        <w:ind w:left="1788" w:hanging="360"/>
+      </w:pPr>
+    </w:lvl>
+    <w:lvl w:ilvl="2" w:tplc="0416001B" w:tentative="1">
+      <w:start w:val="1"/>
+      <w:numFmt w:val="lowerRoman"/>
+      <w:lvlText w:val="%3."/>
+      <w:lvlJc w:val="right"/>
+      <w:pPr>
+        <w:ind w:left="2508" w:hanging="180"/>
+      </w:pPr>
+    </w:lvl>
+    <w:lvl w:ilvl="3" w:tplc="0416000F" w:tentative="1">
+      <w:start w:val="1"/>
+      <w:numFmt w:val="decimal"/>
+      <w:lvlText w:val="%4."/>
+      <w:lvlJc w:val="left"/>
+      <w:pPr>
+        <w:ind w:left="3228" w:hanging="360"/>
+      </w:pPr>
+    </w:lvl>
+    <w:lvl w:ilvl="4" w:tplc="04160019" w:tentative="1">
+      <w:start w:val="1"/>
+      <w:numFmt w:val="lowerLetter"/>
+      <w:lvlText w:val="%5."/>
+      <w:lvlJc w:val="left"/>
+      <w:pPr>
+        <w:ind w:left="3948" w:hanging="360"/>
+      </w:pPr>
+    </w:lvl>
+    <w:lvl w:ilvl="5" w:tplc="0416001B" w:tentative="1">
+      <w:start w:val="1"/>
+      <w:numFmt w:val="lowerRoman"/>
+      <w:lvlText w:val="%6."/>
+      <w:lvlJc w:val="right"/>
+      <w:pPr>
+        <w:ind w:left="4668" w:hanging="180"/>
+      </w:pPr>
+    </w:lvl>
+    <w:lvl w:ilvl="6" w:tplc="0416000F" w:tentative="1">
+      <w:start w:val="1"/>
+      <w:numFmt w:val="decimal"/>
+      <w:lvlText w:val="%7."/>
+      <w:lvlJc w:val="left"/>
+      <w:pPr>
+        <w:ind w:left="5388" w:hanging="360"/>
+      </w:pPr>
+    </w:lvl>
+    <w:lvl w:ilvl="7" w:tplc="04160019" w:tentative="1">
+      <w:start w:val="1"/>
+      <w:numFmt w:val="lowerLetter"/>
+      <w:lvlText w:val="%8."/>
+      <w:lvlJc w:val="left"/>
+      <w:pPr>
+        <w:ind w:left="6108" w:hanging="360"/>
+      </w:pPr>
+    </w:lvl>
+    <w:lvl w:ilvl="8" w:tplc="0416001B" w:tentative="1">
+      <w:start w:val="1"/>
+      <w:numFmt w:val="lowerRoman"/>
+      <w:lvlText w:val="%9."/>
+      <w:lvlJc w:val="right"/>
+      <w:pPr>
+        <w:ind w:left="6828" w:hanging="180"/>
+      </w:pPr>
+    </w:lvl>
+  </w:abstractNum>
+  <w:abstractNum w:abstractNumId="3" w15:restartNumberingAfterBreak="0">
+    <w:nsid w:val="2C422A4D"/>
+    <w:multiLevelType w:val="hybridMultilevel"/>
+    <w:tmpl w:val="0180D1B6"/>
+    <w:lvl w:ilvl="0" w:tplc="FFFFFFFF">
+      <w:start w:val="1"/>
+      <w:numFmt w:val="decimal"/>
+      <w:lvlText w:val="%1."/>
+      <w:lvlJc w:val="left"/>
+      <w:pPr>
+        <w:ind w:left="1440" w:hanging="360"/>
+      </w:pPr>
+    </w:lvl>
+    <w:lvl w:ilvl="1" w:tplc="04160019" w:tentative="1">
+      <w:start w:val="1"/>
+      <w:numFmt w:val="lowerLetter"/>
+      <w:lvlText w:val="%2."/>
+      <w:lvlJc w:val="left"/>
+      <w:pPr>
+        <w:ind w:left="2160" w:hanging="360"/>
+      </w:pPr>
+    </w:lvl>
+    <w:lvl w:ilvl="2" w:tplc="0416001B" w:tentative="1">
+      <w:start w:val="1"/>
+      <w:numFmt w:val="lowerRoman"/>
+      <w:lvlText w:val="%3."/>
+      <w:lvlJc w:val="right"/>
+      <w:pPr>
+        <w:ind w:left="2880" w:hanging="180"/>
+      </w:pPr>
+    </w:lvl>
+    <w:lvl w:ilvl="3" w:tplc="0416000F" w:tentative="1">
+      <w:start w:val="1"/>
+      <w:numFmt w:val="decimal"/>
+      <w:lvlText w:val="%4."/>
+      <w:lvlJc w:val="left"/>
+      <w:pPr>
+        <w:ind w:left="3600" w:hanging="360"/>
+      </w:pPr>
+    </w:lvl>
+    <w:lvl w:ilvl="4" w:tplc="04160019" w:tentative="1">
+      <w:start w:val="1"/>
+      <w:numFmt w:val="lowerLetter"/>
+      <w:lvlText w:val="%5."/>
+      <w:lvlJc w:val="left"/>
+      <w:pPr>
+        <w:ind w:left="4320" w:hanging="360"/>
+      </w:pPr>
+    </w:lvl>
+    <w:lvl w:ilvl="5" w:tplc="0416001B" w:tentative="1">
+      <w:start w:val="1"/>
+      <w:numFmt w:val="lowerRoman"/>
+      <w:lvlText w:val="%6."/>
+      <w:lvlJc w:val="right"/>
+      <w:pPr>
+        <w:ind w:left="5040" w:hanging="180"/>
+      </w:pPr>
+    </w:lvl>
+    <w:lvl w:ilvl="6" w:tplc="0416000F" w:tentative="1">
+      <w:start w:val="1"/>
+      <w:numFmt w:val="decimal"/>
+      <w:lvlText w:val="%7."/>
+      <w:lvlJc w:val="left"/>
+      <w:pPr>
+        <w:ind w:left="5760" w:hanging="360"/>
+      </w:pPr>
+    </w:lvl>
+    <w:lvl w:ilvl="7" w:tplc="04160019" w:tentative="1">
+      <w:start w:val="1"/>
+      <w:numFmt w:val="lowerLetter"/>
+      <w:lvlText w:val="%8."/>
+      <w:lvlJc w:val="left"/>
+      <w:pPr>
+        <w:ind w:left="6480" w:hanging="360"/>
+      </w:pPr>
+    </w:lvl>
+    <w:lvl w:ilvl="8" w:tplc="0416001B" w:tentative="1">
+      <w:start w:val="1"/>
+      <w:numFmt w:val="lowerRoman"/>
+      <w:lvlText w:val="%9."/>
+      <w:lvlJc w:val="right"/>
+      <w:pPr>
+        <w:ind w:left="7200" w:hanging="180"/>
+      </w:pPr>
+    </w:lvl>
+  </w:abstractNum>
+  <w:abstractNum w:abstractNumId="4" w15:restartNumberingAfterBreak="0">
+    <w:nsid w:val="36941C27"/>
+    <w:multiLevelType w:val="hybridMultilevel"/>
+    <w:tmpl w:val="B40CBAA6"/>
+    <w:lvl w:ilvl="0" w:tplc="FFFFFFFF">
+      <w:start w:val="1"/>
+      <w:numFmt w:val="decimal"/>
+      <w:lvlText w:val="%1."/>
+      <w:lvlJc w:val="left"/>
+      <w:pPr>
+        <w:ind w:left="720" w:hanging="360"/>
+      </w:pPr>
+    </w:lvl>
+    <w:lvl w:ilvl="1" w:tplc="FFFFFFFF" w:tentative="1">
+      <w:start w:val="1"/>
+      <w:numFmt w:val="lowerLetter"/>
+      <w:lvlText w:val="%2."/>
+      <w:lvlJc w:val="left"/>
+      <w:pPr>
+        <w:ind w:left="1440" w:hanging="360"/>
+      </w:pPr>
+    </w:lvl>
+    <w:lvl w:ilvl="2" w:tplc="FFFFFFFF" w:tentative="1">
+      <w:start w:val="1"/>
+      <w:numFmt w:val="lowerRoman"/>
+      <w:lvlText w:val="%3."/>
+      <w:lvlJc w:val="right"/>
+      <w:pPr>
+        <w:ind w:left="2160" w:hanging="180"/>
+      </w:pPr>
+    </w:lvl>
+    <w:lvl w:ilvl="3" w:tplc="FFFFFFFF" w:tentative="1">
+      <w:start w:val="1"/>
+      <w:numFmt w:val="decimal"/>
+      <w:lvlText w:val="%4."/>
+      <w:lvlJc w:val="left"/>
+      <w:pPr>
+        <w:ind w:left="2880" w:hanging="360"/>
+      </w:pPr>
+    </w:lvl>
+    <w:lvl w:ilvl="4" w:tplc="FFFFFFFF" w:tentative="1">
+      <w:start w:val="1"/>
+      <w:numFmt w:val="lowerLetter"/>
+      <w:lvlText w:val="%5."/>
+      <w:lvlJc w:val="left"/>
+      <w:pPr>
+        <w:ind w:left="3600" w:hanging="360"/>
+      </w:pPr>
+    </w:lvl>
+    <w:lvl w:ilvl="5" w:tplc="FFFFFFFF" w:tentative="1">
+      <w:start w:val="1"/>
+      <w:numFmt w:val="lowerRoman"/>
+      <w:lvlText w:val="%6."/>
+      <w:lvlJc w:val="right"/>
+      <w:pPr>
+        <w:ind w:left="4320" w:hanging="180"/>
+      </w:pPr>
+    </w:lvl>
+    <w:lvl w:ilvl="6" w:tplc="FFFFFFFF" w:tentative="1">
+      <w:start w:val="1"/>
+      <w:numFmt w:val="decimal"/>
+      <w:lvlText w:val="%7."/>
+      <w:lvlJc w:val="left"/>
+      <w:pPr>
+        <w:ind w:left="5040" w:hanging="360"/>
+      </w:pPr>
+    </w:lvl>
+    <w:lvl w:ilvl="7" w:tplc="FFFFFFFF" w:tentative="1">
+      <w:start w:val="1"/>
+      <w:numFmt w:val="lowerLetter"/>
+      <w:lvlText w:val="%8."/>
+      <w:lvlJc w:val="left"/>
+      <w:pPr>
+        <w:ind w:left="5760" w:hanging="360"/>
+      </w:pPr>
+    </w:lvl>
+    <w:lvl w:ilvl="8" w:tplc="FFFFFFFF" w:tentative="1">
       <w:start w:val="1"/>
       <w:numFmt w:val="lowerRoman"/>
       <w:lvlText w:val="%9."/>
@@ -431,6 +745,15 @@
   </w:num>
   <w:num w:numId="2" w16cid:durableId="1406489926">
     <w:abstractNumId w:val="1"/>
+  </w:num>
+  <w:num w:numId="3" w16cid:durableId="929201089">
+    <w:abstractNumId w:val="4"/>
+  </w:num>
+  <w:num w:numId="4" w16cid:durableId="1684942194">
+    <w:abstractNumId w:val="3"/>
+  </w:num>
+  <w:num w:numId="5" w16cid:durableId="1683119651">
+    <w:abstractNumId w:val="2"/>
   </w:num>
 </w:numbering>
 </file>
@@ -1038,6 +1361,7 @@
   <w:style w:type="character" w:default="1" w:styleId="Fontepargpadro">
     <w:name w:val="Default Paragraph Font"/>
     <w:uiPriority w:val="1"/>
+    <w:semiHidden/>
     <w:unhideWhenUsed/>
   </w:style>
   <w:style w:type="table" w:default="1" w:styleId="Tabelanormal">

</xml_diff>